<commit_message>
style(cv): Al-Shablan template - fix image padding, narrow full body column, passport top-left, QR on page 2
</commit_message>
<xml_diff>
--- a/server/templates/CV Al-shablan.docx
+++ b/server/templates/CV Al-shablan.docx
@@ -56,10 +56,17 @@
                     <w:bottom w:val="single" w:color="000000" w:sz="4"/>
                     <w:right w:val="single" w:color="000000" w:sz="4"/>
                   </w:tcBorders>
-                  <w:vAlign w:val="center"/>
-                </w:tcPr>
-                <w:p>
-                  <w:pPr>
+                  <w:tcMar>
+                    <w:top w:type="dxa" w:w="0"/>
+                    <w:left w:type="dxa" w:w="0"/>
+                    <w:bottom w:type="dxa" w:w="0"/>
+                    <w:right w:type="dxa" w:w="0"/>
+                  </w:tcMar>
+                  <w:vAlign w:val="center"/>
+                </w:tcPr>
+                <w:p>
+                  <w:pPr>
+                    <w:spacing w:after="0" w:before="0"/>
                     <w:jc w:val="center"/>
                   </w:pPr>
                   <w:r>
@@ -643,7 +650,7 @@
       <w:tr>
         <w:tc>
           <w:tcPr>
-            <w:tcW w:type="pct" w:w="45%"/>
+            <w:tcW w:type="pct" w:w="56%"/>
             <w:tcBorders>
               <w:top w:val="none" w:color="auto" w:sz="0"/>
               <w:left w:val="none" w:color="auto" w:sz="0"/>
@@ -2686,7 +2693,7 @@
         </w:tc>
         <w:tc>
           <w:tcPr>
-            <w:tcW w:type="pct" w:w="55%"/>
+            <w:tcW w:type="pct" w:w="44%"/>
             <w:tcBorders>
               <w:top w:val="none" w:color="auto" w:sz="0"/>
               <w:left w:val="none" w:color="auto" w:sz="0"/>

</xml_diff>